<commit_message>
Deployed 5655f12 with MkDocs version: 1.6.1
</commit_message>
<xml_diff>
--- a/en/syllabus/cen429-izlence-ders-notu.docx
+++ b/en/syllabus/cen429-izlence-ders-notu.docx
@@ -2,7 +2,7 @@
 <file path=word/document.xml><?xml version="1.0" encoding="utf-8"?>
 <w:document xmlns:w="http://schemas.openxmlformats.org/wordprocessingml/2006/main" xmlns:m="http://schemas.openxmlformats.org/officeDocument/2006/math" xmlns:r="http://schemas.openxmlformats.org/officeDocument/2006/relationships" xmlns:o="urn:schemas-microsoft-com:office:office" xmlns:v="urn:schemas-microsoft-com:vml" xmlns:w10="urn:schemas-microsoft-com:office:word" xmlns:a="http://schemas.openxmlformats.org/drawingml/2006/main" xmlns:pic="http://schemas.openxmlformats.org/drawingml/2006/picture" xmlns:wp="http://schemas.openxmlformats.org/drawingml/2006/wordprocessingDrawing">
   <w:body>
-    <w:bookmarkStart w:id="39" w:name="recep-tayyip-erdoğan-university"/>
+    <w:bookmarkStart w:id="56" w:name="recep-tayyip-erdoğan-university"/>
     <w:p>
       <w:pPr>
         <w:pStyle w:val="Heading1"/>
@@ -48,7 +48,7 @@
     <w:bookmarkEnd w:id="20"/>
     <w:bookmarkEnd w:id="21"/>
     <w:bookmarkEnd w:id="22"/>
-    <w:bookmarkStart w:id="23" w:name="course-information"/>
+    <w:bookmarkStart w:id="24" w:name="course-information"/>
     <w:p>
       <w:pPr>
         <w:pStyle w:val="Heading2"/>
@@ -381,8 +381,19 @@
               <w:pStyle w:val="Compact"/>
             </w:pPr>
             <w:r>
-              <w:t xml:space="preserve">CEN107 Algorithms and Programming I (former code CE103)</w:t>
-            </w:r>
+              <w:t xml:space="preserve">CEN107 Algorithms and Programming I (former code CE103) — details:</w:t>
+            </w:r>
+            <w:r>
+              <w:t xml:space="preserve"> </w:t>
+            </w:r>
+            <w:hyperlink r:id="rId23">
+              <w:r>
+                <w:rPr>
+                  <w:rStyle w:val="Hyperlink"/>
+                </w:rPr>
+                <w:t xml:space="preserve">Prerequisites</w:t>
+              </w:r>
+            </w:hyperlink>
           </w:p>
         </w:tc>
       </w:tr>
@@ -394,8 +405,8 @@
         </w:pict>
       </w:r>
     </w:p>
-    <w:bookmarkEnd w:id="23"/>
-    <w:bookmarkStart w:id="24" w:name="a.-course-description"/>
+    <w:bookmarkEnd w:id="24"/>
+    <w:bookmarkStart w:id="25" w:name="a.-course-description"/>
     <w:p>
       <w:pPr>
         <w:pStyle w:val="Heading2"/>
@@ -455,8 +466,8 @@
         </w:pict>
       </w:r>
     </w:p>
-    <w:bookmarkEnd w:id="24"/>
-    <w:bookmarkStart w:id="26" w:name="b.-learning-outcomes"/>
+    <w:bookmarkEnd w:id="25"/>
+    <w:bookmarkStart w:id="27" w:name="b.-learning-outcomes"/>
     <w:p>
       <w:pPr>
         <w:pStyle w:val="Heading2"/>
@@ -680,7 +691,7 @@
         </w:tc>
       </w:tr>
     </w:tbl>
-    <w:bookmarkStart w:id="25" w:name="X8664d3ebde3fd601a87e584f5729272c2abc229"/>
+    <w:bookmarkStart w:id="26" w:name="X8664d3ebde3fd601a87e584f5729272c2abc229"/>
     <w:p>
       <w:pPr>
         <w:pStyle w:val="Heading3"/>
@@ -1893,9 +1904,9 @@
         </w:pict>
       </w:r>
     </w:p>
-    <w:bookmarkEnd w:id="25"/>
     <w:bookmarkEnd w:id="26"/>
-    <w:bookmarkStart w:id="27" w:name="c.-weekly-schedule"/>
+    <w:bookmarkEnd w:id="27"/>
+    <w:bookmarkStart w:id="44" w:name="c.-weekly-schedule"/>
     <w:p>
       <w:pPr>
         <w:pStyle w:val="Heading2"/>
@@ -2017,9 +2028,14 @@
             <w:pPr>
               <w:pStyle w:val="Compact"/>
             </w:pPr>
-            <w:r>
-              <w:t xml:space="preserve">1</w:t>
-            </w:r>
+            <w:hyperlink r:id="rId28">
+              <w:r>
+                <w:rPr>
+                  <w:rStyle w:val="Hyperlink"/>
+                </w:rPr>
+                <w:t xml:space="preserve">1</w:t>
+              </w:r>
+            </w:hyperlink>
           </w:p>
         </w:tc>
         <w:tc>
@@ -2063,9 +2079,14 @@
             <w:pPr>
               <w:pStyle w:val="Compact"/>
             </w:pPr>
-            <w:r>
-              <w:t xml:space="preserve">2</w:t>
-            </w:r>
+            <w:hyperlink r:id="rId29">
+              <w:r>
+                <w:rPr>
+                  <w:rStyle w:val="Hyperlink"/>
+                </w:rPr>
+                <w:t xml:space="preserve">2</w:t>
+              </w:r>
+            </w:hyperlink>
           </w:p>
         </w:tc>
         <w:tc>
@@ -2109,9 +2130,14 @@
             <w:pPr>
               <w:pStyle w:val="Compact"/>
             </w:pPr>
-            <w:r>
-              <w:t xml:space="preserve">3</w:t>
-            </w:r>
+            <w:hyperlink r:id="rId30">
+              <w:r>
+                <w:rPr>
+                  <w:rStyle w:val="Hyperlink"/>
+                </w:rPr>
+                <w:t xml:space="preserve">3</w:t>
+              </w:r>
+            </w:hyperlink>
           </w:p>
         </w:tc>
         <w:tc>
@@ -2155,9 +2181,14 @@
             <w:pPr>
               <w:pStyle w:val="Compact"/>
             </w:pPr>
-            <w:r>
-              <w:t xml:space="preserve">4</w:t>
-            </w:r>
+            <w:hyperlink r:id="rId31">
+              <w:r>
+                <w:rPr>
+                  <w:rStyle w:val="Hyperlink"/>
+                </w:rPr>
+                <w:t xml:space="preserve">4</w:t>
+              </w:r>
+            </w:hyperlink>
           </w:p>
         </w:tc>
         <w:tc>
@@ -2201,9 +2232,14 @@
             <w:pPr>
               <w:pStyle w:val="Compact"/>
             </w:pPr>
-            <w:r>
-              <w:t xml:space="preserve">5</w:t>
-            </w:r>
+            <w:hyperlink r:id="rId32">
+              <w:r>
+                <w:rPr>
+                  <w:rStyle w:val="Hyperlink"/>
+                </w:rPr>
+                <w:t xml:space="preserve">5</w:t>
+              </w:r>
+            </w:hyperlink>
           </w:p>
         </w:tc>
         <w:tc>
@@ -2247,9 +2283,14 @@
             <w:pPr>
               <w:pStyle w:val="Compact"/>
             </w:pPr>
-            <w:r>
-              <w:t xml:space="preserve">6</w:t>
-            </w:r>
+            <w:hyperlink r:id="rId33">
+              <w:r>
+                <w:rPr>
+                  <w:rStyle w:val="Hyperlink"/>
+                </w:rPr>
+                <w:t xml:space="preserve">6</w:t>
+              </w:r>
+            </w:hyperlink>
           </w:p>
         </w:tc>
         <w:tc>
@@ -2293,9 +2334,14 @@
             <w:pPr>
               <w:pStyle w:val="Compact"/>
             </w:pPr>
-            <w:r>
-              <w:t xml:space="preserve">7</w:t>
-            </w:r>
+            <w:hyperlink r:id="rId34">
+              <w:r>
+                <w:rPr>
+                  <w:rStyle w:val="Hyperlink"/>
+                </w:rPr>
+                <w:t xml:space="preserve">7</w:t>
+              </w:r>
+            </w:hyperlink>
           </w:p>
         </w:tc>
         <w:tc>
@@ -2349,9 +2395,14 @@
             <w:pPr>
               <w:pStyle w:val="Compact"/>
             </w:pPr>
-            <w:r>
-              <w:t xml:space="preserve">8</w:t>
-            </w:r>
+            <w:hyperlink r:id="rId35">
+              <w:r>
+                <w:rPr>
+                  <w:rStyle w:val="Hyperlink"/>
+                </w:rPr>
+                <w:t xml:space="preserve">8</w:t>
+              </w:r>
+            </w:hyperlink>
           </w:p>
         </w:tc>
         <w:tc>
@@ -2405,9 +2456,14 @@
             <w:pPr>
               <w:pStyle w:val="Compact"/>
             </w:pPr>
-            <w:r>
-              <w:t xml:space="preserve">9</w:t>
-            </w:r>
+            <w:hyperlink r:id="rId36">
+              <w:r>
+                <w:rPr>
+                  <w:rStyle w:val="Hyperlink"/>
+                </w:rPr>
+                <w:t xml:space="preserve">9</w:t>
+              </w:r>
+            </w:hyperlink>
           </w:p>
         </w:tc>
         <w:tc>
@@ -2451,9 +2507,14 @@
             <w:pPr>
               <w:pStyle w:val="Compact"/>
             </w:pPr>
-            <w:r>
-              <w:t xml:space="preserve">10</w:t>
-            </w:r>
+            <w:hyperlink r:id="rId37">
+              <w:r>
+                <w:rPr>
+                  <w:rStyle w:val="Hyperlink"/>
+                </w:rPr>
+                <w:t xml:space="preserve">10</w:t>
+              </w:r>
+            </w:hyperlink>
           </w:p>
         </w:tc>
         <w:tc>
@@ -2497,9 +2558,14 @@
             <w:pPr>
               <w:pStyle w:val="Compact"/>
             </w:pPr>
-            <w:r>
-              <w:t xml:space="preserve">11</w:t>
-            </w:r>
+            <w:hyperlink r:id="rId38">
+              <w:r>
+                <w:rPr>
+                  <w:rStyle w:val="Hyperlink"/>
+                </w:rPr>
+                <w:t xml:space="preserve">11</w:t>
+              </w:r>
+            </w:hyperlink>
           </w:p>
         </w:tc>
         <w:tc>
@@ -2543,9 +2609,14 @@
             <w:pPr>
               <w:pStyle w:val="Compact"/>
             </w:pPr>
-            <w:r>
-              <w:t xml:space="preserve">12</w:t>
-            </w:r>
+            <w:hyperlink r:id="rId39">
+              <w:r>
+                <w:rPr>
+                  <w:rStyle w:val="Hyperlink"/>
+                </w:rPr>
+                <w:t xml:space="preserve">12</w:t>
+              </w:r>
+            </w:hyperlink>
           </w:p>
         </w:tc>
         <w:tc>
@@ -2589,9 +2660,14 @@
             <w:pPr>
               <w:pStyle w:val="Compact"/>
             </w:pPr>
-            <w:r>
-              <w:t xml:space="preserve">13</w:t>
-            </w:r>
+            <w:hyperlink r:id="rId40">
+              <w:r>
+                <w:rPr>
+                  <w:rStyle w:val="Hyperlink"/>
+                </w:rPr>
+                <w:t xml:space="preserve">13</w:t>
+              </w:r>
+            </w:hyperlink>
           </w:p>
         </w:tc>
         <w:tc>
@@ -2635,9 +2711,14 @@
             <w:pPr>
               <w:pStyle w:val="Compact"/>
             </w:pPr>
-            <w:r>
-              <w:t xml:space="preserve">14</w:t>
-            </w:r>
+            <w:hyperlink r:id="rId41">
+              <w:r>
+                <w:rPr>
+                  <w:rStyle w:val="Hyperlink"/>
+                </w:rPr>
+                <w:t xml:space="preserve">14</w:t>
+              </w:r>
+            </w:hyperlink>
           </w:p>
         </w:tc>
         <w:tc>
@@ -2681,9 +2762,14 @@
             <w:pPr>
               <w:pStyle w:val="Compact"/>
             </w:pPr>
-            <w:r>
-              <w:t xml:space="preserve">15</w:t>
-            </w:r>
+            <w:hyperlink r:id="rId42">
+              <w:r>
+                <w:rPr>
+                  <w:rStyle w:val="Hyperlink"/>
+                </w:rPr>
+                <w:t xml:space="preserve">15</w:t>
+              </w:r>
+            </w:hyperlink>
           </w:p>
         </w:tc>
         <w:tc>
@@ -2737,9 +2823,14 @@
             <w:pPr>
               <w:pStyle w:val="Compact"/>
             </w:pPr>
-            <w:r>
-              <w:t xml:space="preserve">16</w:t>
-            </w:r>
+            <w:hyperlink r:id="rId43">
+              <w:r>
+                <w:rPr>
+                  <w:rStyle w:val="Hyperlink"/>
+                </w:rPr>
+                <w:t xml:space="preserve">16</w:t>
+              </w:r>
+            </w:hyperlink>
           </w:p>
         </w:tc>
         <w:tc>
@@ -2814,8 +2905,8 @@
         </w:pict>
       </w:r>
     </w:p>
-    <w:bookmarkEnd w:id="27"/>
-    <w:bookmarkStart w:id="28" w:name="d.-textbooks-software-and-equipment"/>
+    <w:bookmarkEnd w:id="44"/>
+    <w:bookmarkStart w:id="45" w:name="d.-textbooks-software-and-equipment"/>
     <w:p>
       <w:pPr>
         <w:pStyle w:val="Heading2"/>
@@ -3198,8 +3289,8 @@
         </w:pict>
       </w:r>
     </w:p>
-    <w:bookmarkEnd w:id="28"/>
-    <w:bookmarkStart w:id="30" w:name="e.-assessment"/>
+    <w:bookmarkEnd w:id="45"/>
+    <w:bookmarkStart w:id="47" w:name="e.-assessment"/>
     <w:p>
       <w:pPr>
         <w:pStyle w:val="Heading2"/>
@@ -3928,7 +4019,7 @@
         </m:oMath>
       </m:oMathPara>
     </w:p>
-    <w:bookmarkStart w:id="29" w:name="workload-ects-5-125-hours"/>
+    <w:bookmarkStart w:id="46" w:name="workload-ects-5-125-hours"/>
     <w:p>
       <w:pPr>
         <w:pStyle w:val="Heading3"/>
@@ -4376,9 +4467,9 @@
         </w:pict>
       </w:r>
     </w:p>
-    <w:bookmarkEnd w:id="29"/>
-    <w:bookmarkEnd w:id="30"/>
-    <w:bookmarkStart w:id="31" w:name="f.-instructional-strategies-and-methods"/>
+    <w:bookmarkEnd w:id="46"/>
+    <w:bookmarkEnd w:id="47"/>
+    <w:bookmarkStart w:id="48" w:name="f.-instructional-strategies-and-methods"/>
     <w:p>
       <w:pPr>
         <w:pStyle w:val="Heading2"/>
@@ -4426,8 +4517,8 @@
         </w:pict>
       </w:r>
     </w:p>
-    <w:bookmarkEnd w:id="31"/>
-    <w:bookmarkStart w:id="32" w:name="g.-late-homework"/>
+    <w:bookmarkEnd w:id="48"/>
+    <w:bookmarkStart w:id="49" w:name="g.-late-homework"/>
     <w:p>
       <w:pPr>
         <w:pStyle w:val="Heading2"/>
@@ -4457,8 +4548,8 @@
         </w:pict>
       </w:r>
     </w:p>
-    <w:bookmarkEnd w:id="32"/>
-    <w:bookmarkStart w:id="33" w:name="h.-course-platform-and-communication"/>
+    <w:bookmarkEnd w:id="49"/>
+    <w:bookmarkStart w:id="50" w:name="h.-course-platform-and-communication"/>
     <w:p>
       <w:pPr>
         <w:pStyle w:val="Heading2"/>
@@ -4494,8 +4585,8 @@
         </w:pict>
       </w:r>
     </w:p>
-    <w:bookmarkEnd w:id="33"/>
-    <w:bookmarkStart w:id="36" w:name="X727147e054bfc715bb874db619c5c8cfeda5a5f"/>
+    <w:bookmarkEnd w:id="50"/>
+    <w:bookmarkStart w:id="53" w:name="X727147e054bfc715bb874db619c5c8cfeda5a5f"/>
     <w:p>
       <w:pPr>
         <w:pStyle w:val="Heading2"/>
@@ -4627,7 +4718,7 @@
         <w:t xml:space="preserve">you intend to do stays within academic honesty.</w:t>
       </w:r>
     </w:p>
-    <w:bookmarkStart w:id="34" w:name="X14753e3786b6b4c08f708356f4d3d122c6218bb"/>
+    <w:bookmarkStart w:id="51" w:name="X14753e3786b6b4c08f708356f4d3d122c6218bb"/>
     <w:p>
       <w:pPr>
         <w:pStyle w:val="Heading3"/>
@@ -4732,8 +4823,8 @@
         <w:t xml:space="preserve">Working with (even paying) a tutor, provided the tutor does not do your assignment for you.</w:t>
       </w:r>
     </w:p>
-    <w:bookmarkEnd w:id="34"/>
-    <w:bookmarkStart w:id="35" w:name="b.-what-is-not-acceptable"/>
+    <w:bookmarkEnd w:id="51"/>
+    <w:bookmarkStart w:id="52" w:name="b.-what-is-not-acceptable"/>
     <w:p>
       <w:pPr>
         <w:pStyle w:val="Heading3"/>
@@ -4785,9 +4876,9 @@
         </w:pict>
       </w:r>
     </w:p>
-    <w:bookmarkEnd w:id="35"/>
-    <w:bookmarkEnd w:id="36"/>
-    <w:bookmarkStart w:id="37" w:name="j.-expectations"/>
+    <w:bookmarkEnd w:id="52"/>
+    <w:bookmarkEnd w:id="53"/>
+    <w:bookmarkStart w:id="54" w:name="j.-expectations"/>
     <w:p>
       <w:pPr>
         <w:pStyle w:val="Heading2"/>
@@ -4842,8 +4933,8 @@
         </w:pict>
       </w:r>
     </w:p>
-    <w:bookmarkEnd w:id="37"/>
-    <w:bookmarkStart w:id="38" w:name="k.-lecture-content-and-syllabus-updates"/>
+    <w:bookmarkEnd w:id="54"/>
+    <w:bookmarkStart w:id="55" w:name="k.-lecture-content-and-syllabus-updates"/>
     <w:p>
       <w:pPr>
         <w:pStyle w:val="Heading2"/>
@@ -4866,8 +4957,8 @@
         <w:t xml:space="preserve">document will be announced by the instructor.</w:t>
       </w:r>
     </w:p>
-    <w:bookmarkEnd w:id="38"/>
-    <w:bookmarkEnd w:id="39"/>
+    <w:bookmarkEnd w:id="55"/>
+    <w:bookmarkEnd w:id="56"/>
     <w:sectPr>
       <w:headerReference r:id="rId9" w:type="default"/>
       <w:footerReference r:id="rId10" w:type="default"/>

</xml_diff>